<commit_message>
docs: set operational admission capability and MVP docs to Approved
</commit_message>
<xml_diff>
--- a/docs/DOC-037 — Operational Admission Capability.docx
+++ b/docs/DOC-037 — Operational Admission Capability.docx
@@ -78,7 +78,21 @@
         <w:rPr>
           <w:rtl w:val="0"/>
         </w:rPr>
-        <w:t xml:space="preserve"> Draft</w:t>
+        <w:t xml:space="preserve"> </w:t>
+      </w:r>
+      <w:r>
+        <w:rPr>
+          <w:rFonts w:ascii="Roboto Mono" w:cs="Roboto Mono" w:eastAsia="Roboto Mono" w:hAnsi="Roboto Mono"/>
+          <w:color w:val="188038"/>
+          <w:rtl w:val="0"/>
+        </w:rPr>
+        <w:t xml:space="preserve">Approved</w:t>
+      </w:r>
+      <w:r>
+        <w:rPr>
+          <w:rtl w:val="0"/>
+        </w:rPr>
+        <w:t xml:space="preserve"> </w:t>
         <w:br w:type="textWrapping"/>
       </w:r>
       <w:r>

</xml_diff>